<commit_message>
fix(resume): fix missmatch year and gpa
</commit_message>
<xml_diff>
--- a/Fachridan Tio Mu'afa_CV (Android).docx
+++ b/Fachridan Tio Mu'afa_CV (Android).docx
@@ -14,7 +14,6 @@
           <w:szCs w:val="40"/>
         </w:rPr>
       </w:pPr>
-      <w:proofErr w:type="spellStart"/>
       <w:r>
         <w:rPr>
           <w:rFonts w:ascii="Times New Roman" w:eastAsia="Times New Roman" w:hAnsi="Times New Roman" w:cs="Times New Roman"/>
@@ -22,17 +21,7 @@
           <w:sz w:val="40"/>
           <w:szCs w:val="40"/>
         </w:rPr>
-        <w:t>Fachridan</w:t>
-      </w:r>
-      <w:proofErr w:type="spellEnd"/>
-      <w:r>
-        <w:rPr>
-          <w:rFonts w:ascii="Times New Roman" w:eastAsia="Times New Roman" w:hAnsi="Times New Roman" w:cs="Times New Roman"/>
-          <w:b/>
-          <w:sz w:val="40"/>
-          <w:szCs w:val="40"/>
-        </w:rPr>
-        <w:t xml:space="preserve"> Tio </w:t>
+        <w:t xml:space="preserve">Fachridan Tio </w:t>
       </w:r>
       <w:proofErr w:type="spellStart"/>
       <w:r>
@@ -333,7 +322,19 @@
         <w:rPr>
           <w:rFonts w:ascii="Times New Roman" w:eastAsia="Times New Roman" w:hAnsi="Times New Roman" w:cs="Times New Roman"/>
         </w:rPr>
-        <w:t>Achieved GPA 3.70/4.00</w:t>
+        <w:t>Achieved GPA 3.7</w:t>
+      </w:r>
+      <w:r>
+        <w:rPr>
+          <w:rFonts w:ascii="Times New Roman" w:eastAsia="Times New Roman" w:hAnsi="Times New Roman" w:cs="Times New Roman"/>
+        </w:rPr>
+        <w:t>2</w:t>
+      </w:r>
+      <w:r>
+        <w:rPr>
+          <w:rFonts w:ascii="Times New Roman" w:eastAsia="Times New Roman" w:hAnsi="Times New Roman" w:cs="Times New Roman"/>
+        </w:rPr>
+        <w:t>/4.00</w:t>
       </w:r>
     </w:p>
     <w:p>
@@ -861,7 +862,25 @@
           <w:sz w:val="24"/>
           <w:szCs w:val="24"/>
         </w:rPr>
-        <w:t>Jakarta, July 2024 – April 2023</w:t>
+        <w:t>Jakarta, July 202</w:t>
+      </w:r>
+      <w:r>
+        <w:rPr>
+          <w:rFonts w:ascii="Times New Roman" w:eastAsia="Times New Roman" w:hAnsi="Times New Roman" w:cs="Times New Roman"/>
+          <w:b/>
+          <w:sz w:val="24"/>
+          <w:szCs w:val="24"/>
+        </w:rPr>
+        <w:t>2</w:t>
+      </w:r>
+      <w:r>
+        <w:rPr>
+          <w:rFonts w:ascii="Times New Roman" w:eastAsia="Times New Roman" w:hAnsi="Times New Roman" w:cs="Times New Roman"/>
+          <w:b/>
+          <w:sz w:val="24"/>
+          <w:szCs w:val="24"/>
+        </w:rPr>
+        <w:t xml:space="preserve"> – April 2023</w:t>
       </w:r>
     </w:p>
     <w:p>
@@ -1098,7 +1117,25 @@
           <w:sz w:val="24"/>
           <w:szCs w:val="24"/>
         </w:rPr>
-        <w:t>Jakarta, October 2024 – January 2025</w:t>
+        <w:t xml:space="preserve">Jakarta, </w:t>
+      </w:r>
+      <w:r>
+        <w:rPr>
+          <w:rFonts w:ascii="Times New Roman" w:eastAsia="Times New Roman" w:hAnsi="Times New Roman" w:cs="Times New Roman"/>
+          <w:b/>
+          <w:sz w:val="24"/>
+          <w:szCs w:val="24"/>
+        </w:rPr>
+        <w:t xml:space="preserve">May </w:t>
+      </w:r>
+      <w:r>
+        <w:rPr>
+          <w:rFonts w:ascii="Times New Roman" w:eastAsia="Times New Roman" w:hAnsi="Times New Roman" w:cs="Times New Roman"/>
+          <w:b/>
+          <w:sz w:val="24"/>
+          <w:szCs w:val="24"/>
+        </w:rPr>
+        <w:t>2024 – January 2025</w:t>
       </w:r>
     </w:p>
     <w:p>
@@ -1298,7 +1335,52 @@
           <w:sz w:val="24"/>
           <w:szCs w:val="24"/>
         </w:rPr>
-        <w:t>Jakarta, May – July 2024</w:t>
+        <w:t xml:space="preserve">Jakarta, </w:t>
+      </w:r>
+      <w:r>
+        <w:rPr>
+          <w:rFonts w:ascii="Times New Roman" w:eastAsia="Times New Roman" w:hAnsi="Times New Roman" w:cs="Times New Roman"/>
+          <w:b/>
+          <w:sz w:val="24"/>
+          <w:szCs w:val="24"/>
+        </w:rPr>
+        <w:t>May 2024</w:t>
+      </w:r>
+      <w:r>
+        <w:rPr>
+          <w:rFonts w:ascii="Times New Roman" w:eastAsia="Times New Roman" w:hAnsi="Times New Roman" w:cs="Times New Roman"/>
+          <w:b/>
+          <w:sz w:val="24"/>
+          <w:szCs w:val="24"/>
+        </w:rPr>
+        <w:t xml:space="preserve"> – </w:t>
+      </w:r>
+      <w:r>
+        <w:rPr>
+          <w:rFonts w:ascii="Times New Roman" w:eastAsia="Times New Roman" w:hAnsi="Times New Roman" w:cs="Times New Roman"/>
+          <w:b/>
+          <w:sz w:val="24"/>
+          <w:szCs w:val="24"/>
+        </w:rPr>
+        <w:t>January</w:t>
+      </w:r>
+      <w:r>
+        <w:rPr>
+          <w:rFonts w:ascii="Times New Roman" w:eastAsia="Times New Roman" w:hAnsi="Times New Roman" w:cs="Times New Roman"/>
+          <w:b/>
+          <w:sz w:val="24"/>
+          <w:szCs w:val="24"/>
+        </w:rPr>
+        <w:t xml:space="preserve"> 202</w:t>
+      </w:r>
+      <w:r>
+        <w:rPr>
+          <w:rFonts w:ascii="Times New Roman" w:eastAsia="Times New Roman" w:hAnsi="Times New Roman" w:cs="Times New Roman"/>
+          <w:b/>
+          <w:sz w:val="24"/>
+          <w:szCs w:val="24"/>
+        </w:rPr>
+        <w:t>5</w:t>
       </w:r>
     </w:p>
     <w:p>

</xml_diff>

<commit_message>
feat(edu): update exp gdsc
</commit_message>
<xml_diff>
--- a/Fachridan Tio Mu'afa_CV (Android).docx
+++ b/Fachridan Tio Mu'afa_CV (Android).docx
@@ -1,6 +1,6 @@
 
 <file path=word/document.xml><?xml version="1.0" encoding="utf-8"?>
-<w:document xmlns:wpc="http://schemas.microsoft.com/office/word/2010/wordprocessingCanvas" xmlns:cx="http://schemas.microsoft.com/office/drawing/2014/chartex" xmlns:cx1="http://schemas.microsoft.com/office/drawing/2015/9/8/chartex" xmlns:cx2="http://schemas.microsoft.com/office/drawing/2015/10/21/chartex" xmlns:cx3="http://schemas.microsoft.com/office/drawing/2016/5/9/chartex" xmlns:cx4="http://schemas.microsoft.com/office/drawing/2016/5/10/chartex" xmlns:cx5="http://schemas.microsoft.com/office/drawing/2016/5/11/chartex" xmlns:cx6="http://schemas.microsoft.com/office/drawing/2016/5/12/chartex" xmlns:cx7="http://schemas.microsoft.com/office/drawing/2016/5/13/chartex" xmlns:cx8="http://schemas.microsoft.com/office/drawing/2016/5/14/chartex" xmlns:mc="http://schemas.openxmlformats.org/markup-compatibility/2006" xmlns:aink="http://schemas.microsoft.com/office/drawing/2016/ink" xmlns:am3d="http://schemas.microsoft.com/office/drawing/2017/model3d" xmlns:o="urn:schemas-microsoft-com:office:office" xmlns:oel="http://schemas.microsoft.com/office/2019/extlst" xmlns:r="http://schemas.openxmlformats.org/officeDocument/2006/relationships" xmlns:m="http://schemas.openxmlformats.org/officeDocument/2006/math" xmlns:v="urn:schemas-microsoft-com:vml" xmlns:wp14="http://schemas.microsoft.com/office/word/2010/wordprocessingDrawing" xmlns:wp="http://schemas.openxmlformats.org/drawingml/2006/wordprocessingDrawing" xmlns:w10="urn:schemas-microsoft-com:office:word" xmlns:w="http://schemas.openxmlformats.org/wordprocessingml/2006/main" xmlns:w14="http://schemas.microsoft.com/office/word/2010/wordml" xmlns:w15="http://schemas.microsoft.com/office/word/2012/wordml" xmlns:w16cex="http://schemas.microsoft.com/office/word/2018/wordml/cex" xmlns:w16cid="http://schemas.microsoft.com/office/word/2016/wordml/cid" xmlns:w16="http://schemas.microsoft.com/office/word/2018/wordml" xmlns:w16sdtdh="http://schemas.microsoft.com/office/word/2020/wordml/sdtdatahash" xmlns:w16se="http://schemas.microsoft.com/office/word/2015/wordml/symex" xmlns:wpg="http://schemas.microsoft.com/office/word/2010/wordprocessingGroup" xmlns:wpi="http://schemas.microsoft.com/office/word/2010/wordprocessingInk" xmlns:wne="http://schemas.microsoft.com/office/word/2006/wordml" xmlns:wps="http://schemas.microsoft.com/office/word/2010/wordprocessingShape" mc:Ignorable="w14 w15 w16se w16cid w16 w16cex w16sdtdh wp14">
+<w:document xmlns:wpc="http://schemas.microsoft.com/office/word/2010/wordprocessingCanvas" xmlns:cx="http://schemas.microsoft.com/office/drawing/2014/chartex" xmlns:cx1="http://schemas.microsoft.com/office/drawing/2015/9/8/chartex" xmlns:cx2="http://schemas.microsoft.com/office/drawing/2015/10/21/chartex" xmlns:cx3="http://schemas.microsoft.com/office/drawing/2016/5/9/chartex" xmlns:cx4="http://schemas.microsoft.com/office/drawing/2016/5/10/chartex" xmlns:cx5="http://schemas.microsoft.com/office/drawing/2016/5/11/chartex" xmlns:cx6="http://schemas.microsoft.com/office/drawing/2016/5/12/chartex" xmlns:cx7="http://schemas.microsoft.com/office/drawing/2016/5/13/chartex" xmlns:cx8="http://schemas.microsoft.com/office/drawing/2016/5/14/chartex" xmlns:mc="http://schemas.openxmlformats.org/markup-compatibility/2006" xmlns:aink="http://schemas.microsoft.com/office/drawing/2016/ink" xmlns:am3d="http://schemas.microsoft.com/office/drawing/2017/model3d" xmlns:o="urn:schemas-microsoft-com:office:office" xmlns:oel="http://schemas.microsoft.com/office/2019/extlst" xmlns:r="http://schemas.openxmlformats.org/officeDocument/2006/relationships" xmlns:m="http://schemas.openxmlformats.org/officeDocument/2006/math" xmlns:v="urn:schemas-microsoft-com:vml" xmlns:wp14="http://schemas.microsoft.com/office/word/2010/wordprocessingDrawing" xmlns:wp="http://schemas.openxmlformats.org/drawingml/2006/wordprocessingDrawing" xmlns:w10="urn:schemas-microsoft-com:office:word" xmlns:w="http://schemas.openxmlformats.org/wordprocessingml/2006/main" xmlns:w14="http://schemas.microsoft.com/office/word/2010/wordml" xmlns:w15="http://schemas.microsoft.com/office/word/2012/wordml" xmlns:w16cex="http://schemas.microsoft.com/office/word/2018/wordml/cex" xmlns:w16cid="http://schemas.microsoft.com/office/word/2016/wordml/cid" xmlns:w16="http://schemas.microsoft.com/office/word/2018/wordml" xmlns:w16du="http://schemas.microsoft.com/office/word/2023/wordml/word16du" xmlns:w16sdtdh="http://schemas.microsoft.com/office/word/2020/wordml/sdtdatahash" xmlns:w16sdtfl="http://schemas.microsoft.com/office/word/2024/wordml/sdtformatlock" xmlns:w16se="http://schemas.microsoft.com/office/word/2015/wordml/symex" xmlns:wpg="http://schemas.microsoft.com/office/word/2010/wordprocessingGroup" xmlns:wpi="http://schemas.microsoft.com/office/word/2010/wordprocessingInk" xmlns:wne="http://schemas.microsoft.com/office/word/2006/wordml" xmlns:wps="http://schemas.microsoft.com/office/word/2010/wordprocessingShape" mc:Ignorable="w14 w15 w16se w16cid w16 w16cex w16sdtdh w16sdtfl w16du wp14">
   <w:body>
     <w:p>
       <w:pPr>
@@ -21,19 +21,8 @@
           <w:sz w:val="40"/>
           <w:szCs w:val="40"/>
         </w:rPr>
-        <w:t xml:space="preserve">Fachridan Tio </w:t>
-      </w:r>
-      <w:proofErr w:type="spellStart"/>
-      <w:r>
-        <w:rPr>
-          <w:rFonts w:ascii="Times New Roman" w:eastAsia="Times New Roman" w:hAnsi="Times New Roman" w:cs="Times New Roman"/>
-          <w:b/>
-          <w:sz w:val="40"/>
-          <w:szCs w:val="40"/>
-        </w:rPr>
-        <w:t>Mu’afa</w:t>
-      </w:r>
-      <w:proofErr w:type="spellEnd"/>
+        <w:t>Fachridan Tio Mu’afa</w:t>
+      </w:r>
     </w:p>
     <w:p>
       <w:pPr>
@@ -111,7 +100,7 @@
         <w:rPr>
           <w:noProof/>
         </w:rPr>
-        <w:pict w14:anchorId="2B79E058">
+        <w:pict w14:anchorId="25D34D6B">
           <v:rect id="_x0000_i1030" alt="" style="width:464pt;height:.05pt;mso-width-percent:0;mso-height-percent:0;mso-width-percent:0;mso-height-percent:0" o:hralign="center" o:hrstd="t" o:hr="t" fillcolor="#a0a0a0" stroked="f"/>
         </w:pict>
       </w:r>
@@ -165,21 +154,7 @@
         <w:rPr>
           <w:rFonts w:ascii="Times New Roman" w:eastAsia="Times New Roman" w:hAnsi="Times New Roman" w:cs="Times New Roman"/>
         </w:rPr>
-        <w:t xml:space="preserve">+ years of experience in Android development, specializing in mobile banking, employee self-service platforms, and consumer applications. Proficient in Kotlin, Jetpack Compose, Git, and project management tools like Trello and Jira. Experienced in mentoring and technical advisory as an Instructor and Advisor at </w:t>
-      </w:r>
-      <w:proofErr w:type="spellStart"/>
-      <w:r>
-        <w:rPr>
-          <w:rFonts w:ascii="Times New Roman" w:eastAsia="Times New Roman" w:hAnsi="Times New Roman" w:cs="Times New Roman"/>
-        </w:rPr>
-        <w:t>Bangkit</w:t>
-      </w:r>
-      <w:proofErr w:type="spellEnd"/>
-      <w:r>
-        <w:rPr>
-          <w:rFonts w:ascii="Times New Roman" w:eastAsia="Times New Roman" w:hAnsi="Times New Roman" w:cs="Times New Roman"/>
-        </w:rPr>
-        <w:t xml:space="preserve"> Academy. Adaptable, detail-oriented, and proactive in problem-solving and cross-functional collaboration. Eager to drive innovation in mobile development and build impactful digital solutions.</w:t>
+        <w:t>+ years of experience in Android development, specializing in mobile banking, employee self-service platforms, and consumer applications. Proficient in Kotlin, Jetpack Compose, Git, and project management tools like Trello and Jira. Experienced in mentoring and technical advisory as an Instructor and Advisor at Bangkit Academy. Adaptable, detail-oriented, and proactive in problem-solving and cross-functional collaboration. Eager to drive innovation in mobile development and build impactful digital solutions.</w:t>
       </w:r>
     </w:p>
     <w:p>
@@ -200,7 +175,7 @@
         <w:rPr>
           <w:noProof/>
         </w:rPr>
-        <w:pict w14:anchorId="788091AA">
+        <w:pict w14:anchorId="3B0D91D9">
           <v:rect id="_x0000_i1029" alt="" style="width:467pt;height:.05pt;mso-width-percent:0;mso-height-percent:0;mso-width-percent:0;mso-height-percent:0" o:hralign="center" o:hrstd="t" o:hr="t" fillcolor="#a0a0a0" stroked="f"/>
         </w:pict>
       </w:r>
@@ -239,47 +214,7 @@
           <w:sz w:val="24"/>
           <w:szCs w:val="24"/>
         </w:rPr>
-        <w:t xml:space="preserve">Universitas Islam Negeri </w:t>
-      </w:r>
-      <w:proofErr w:type="spellStart"/>
-      <w:r>
-        <w:rPr>
-          <w:rFonts w:ascii="Times New Roman" w:eastAsia="Times New Roman" w:hAnsi="Times New Roman" w:cs="Times New Roman"/>
-          <w:b/>
-          <w:sz w:val="24"/>
-          <w:szCs w:val="24"/>
-        </w:rPr>
-        <w:t>Syarif</w:t>
-      </w:r>
-      <w:proofErr w:type="spellEnd"/>
-      <w:r>
-        <w:rPr>
-          <w:rFonts w:ascii="Times New Roman" w:eastAsia="Times New Roman" w:hAnsi="Times New Roman" w:cs="Times New Roman"/>
-          <w:b/>
-          <w:sz w:val="24"/>
-          <w:szCs w:val="24"/>
-        </w:rPr>
-        <w:t xml:space="preserve"> </w:t>
-      </w:r>
-      <w:proofErr w:type="spellStart"/>
-      <w:r>
-        <w:rPr>
-          <w:rFonts w:ascii="Times New Roman" w:eastAsia="Times New Roman" w:hAnsi="Times New Roman" w:cs="Times New Roman"/>
-          <w:b/>
-          <w:sz w:val="24"/>
-          <w:szCs w:val="24"/>
-        </w:rPr>
-        <w:t>Hidayatullah</w:t>
-      </w:r>
-      <w:proofErr w:type="spellEnd"/>
-      <w:r>
-        <w:rPr>
-          <w:rFonts w:ascii="Times New Roman" w:eastAsia="Times New Roman" w:hAnsi="Times New Roman" w:cs="Times New Roman"/>
-          <w:b/>
-          <w:sz w:val="24"/>
-          <w:szCs w:val="24"/>
-        </w:rPr>
-        <w:t xml:space="preserve"> Jakarta</w:t>
+        <w:t>Universitas Islam Negeri Syarif Hidayatullah Jakarta</w:t>
       </w:r>
     </w:p>
     <w:p>
@@ -353,7 +288,38 @@
         <w:rPr>
           <w:rFonts w:ascii="Times New Roman" w:eastAsia="Times New Roman" w:hAnsi="Times New Roman" w:cs="Times New Roman"/>
         </w:rPr>
-        <w:t>Related Courses: Programming Fundamentals, Data Structures and Algorithms, Algorithm Design and Analysis, Big Data, Artificial Intelligence, Software Engineering, Software Testing, Project Management</w:t>
+        <w:t>Related Courses: Programming Fundamentals, Data Structures and Algorithms, Algorithm Design and Analysis, Big</w:t>
+      </w:r>
+      <w:r>
+        <w:rPr>
+          <w:rFonts w:ascii="Times New Roman" w:eastAsia="Times New Roman" w:hAnsi="Times New Roman" w:cs="Times New Roman"/>
+        </w:rPr>
+        <w:t xml:space="preserve"> </w:t>
+      </w:r>
+      <w:r>
+        <w:rPr>
+          <w:rFonts w:ascii="Times New Roman" w:eastAsia="Times New Roman" w:hAnsi="Times New Roman" w:cs="Times New Roman"/>
+        </w:rPr>
+        <w:t>Data, Artificial Intelligence, Software Engineering, Software Testing, Project Management</w:t>
+      </w:r>
+    </w:p>
+    <w:p>
+      <w:pPr>
+        <w:widowControl w:val="0"/>
+        <w:numPr>
+          <w:ilvl w:val="0"/>
+          <w:numId w:val="1"/>
+        </w:numPr>
+        <w:spacing w:line="240" w:lineRule="auto"/>
+        <w:rPr>
+          <w:rFonts w:ascii="Times New Roman" w:eastAsia="Times New Roman" w:hAnsi="Times New Roman" w:cs="Times New Roman"/>
+        </w:rPr>
+      </w:pPr>
+      <w:r>
+        <w:rPr>
+          <w:rFonts w:ascii="Times New Roman" w:eastAsia="Times New Roman" w:hAnsi="Times New Roman" w:cs="Times New Roman"/>
+        </w:rPr>
+        <w:t>Google Developer Student Clubs 2021/2022</w:t>
       </w:r>
     </w:p>
     <w:p>
@@ -374,7 +340,7 @@
         <w:rPr>
           <w:noProof/>
         </w:rPr>
-        <w:pict w14:anchorId="5782A05A">
+        <w:pict w14:anchorId="0D11101D">
           <v:rect id="_x0000_i1028" alt="" style="width:472.4pt;height:.05pt;mso-width-percent:0;mso-height-percent:0;mso-width-percent:0;mso-height-percent:0" o:hralign="center" o:hrstd="t" o:hr="t" fillcolor="#a0a0a0" stroked="f"/>
         </w:pict>
       </w:r>
@@ -425,21 +391,7 @@
         <w:rPr>
           <w:rFonts w:ascii="Times New Roman" w:eastAsia="Times New Roman" w:hAnsi="Times New Roman" w:cs="Times New Roman"/>
         </w:rPr>
-        <w:t xml:space="preserve">(Mobile Banking Development for PT. Bank </w:t>
-      </w:r>
-      <w:proofErr w:type="spellStart"/>
-      <w:r>
-        <w:rPr>
-          <w:rFonts w:ascii="Times New Roman" w:eastAsia="Times New Roman" w:hAnsi="Times New Roman" w:cs="Times New Roman"/>
-        </w:rPr>
-        <w:t>Danamon</w:t>
-      </w:r>
-      <w:proofErr w:type="spellEnd"/>
-      <w:r>
-        <w:rPr>
-          <w:rFonts w:ascii="Times New Roman" w:eastAsia="Times New Roman" w:hAnsi="Times New Roman" w:cs="Times New Roman"/>
-        </w:rPr>
-        <w:t xml:space="preserve"> Indonesia – D-Bank PRO 2.0)</w:t>
+        <w:t>(Mobile Banking Development for PT. Bank Danamon Indonesia – D-Bank PRO 2.0)</w:t>
       </w:r>
     </w:p>
     <w:p>
@@ -523,21 +475,7 @@
         <w:rPr>
           <w:rFonts w:ascii="Times New Roman" w:eastAsia="Times New Roman" w:hAnsi="Times New Roman" w:cs="Times New Roman"/>
         </w:rPr>
-        <w:t xml:space="preserve">Launched D-Cash, a cardless cash withdrawal feature, allowing users to withdraw cash at </w:t>
-      </w:r>
-      <w:proofErr w:type="spellStart"/>
-      <w:r>
-        <w:rPr>
-          <w:rFonts w:ascii="Times New Roman" w:eastAsia="Times New Roman" w:hAnsi="Times New Roman" w:cs="Times New Roman"/>
-        </w:rPr>
-        <w:t>Danamon</w:t>
-      </w:r>
-      <w:proofErr w:type="spellEnd"/>
-      <w:r>
-        <w:rPr>
-          <w:rFonts w:ascii="Times New Roman" w:eastAsia="Times New Roman" w:hAnsi="Times New Roman" w:cs="Times New Roman"/>
-        </w:rPr>
-        <w:t xml:space="preserve"> ATMs and partner merchants.</w:t>
+        <w:t>Launched D-Cash, a cardless cash withdrawal feature, allowing users to withdraw cash at Danamon ATMs and partner merchants.</w:t>
       </w:r>
     </w:p>
     <w:p>
@@ -569,21 +507,7 @@
         <w:rPr>
           <w:rFonts w:ascii="Times New Roman" w:eastAsia="Times New Roman" w:hAnsi="Times New Roman" w:cs="Times New Roman"/>
         </w:rPr>
-        <w:t xml:space="preserve">Collaborate cross-functionally with </w:t>
-      </w:r>
-      <w:proofErr w:type="spellStart"/>
-      <w:r>
-        <w:rPr>
-          <w:rFonts w:ascii="Times New Roman" w:eastAsia="Times New Roman" w:hAnsi="Times New Roman" w:cs="Times New Roman"/>
-        </w:rPr>
-        <w:t>DevX</w:t>
-      </w:r>
-      <w:proofErr w:type="spellEnd"/>
-      <w:r>
-        <w:rPr>
-          <w:rFonts w:ascii="Times New Roman" w:eastAsia="Times New Roman" w:hAnsi="Times New Roman" w:cs="Times New Roman"/>
-        </w:rPr>
-        <w:t>, UI/UX, backend, and solution architects to ensure seamless feature integration.</w:t>
+        <w:t>Collaborate cross-functionally with DevX, UI/UX, backend, and solution architects to ensure seamless feature integration.</w:t>
       </w:r>
     </w:p>
     <w:p>
@@ -655,23 +579,7 @@
           <w:rFonts w:ascii="Times New Roman" w:eastAsia="Times New Roman" w:hAnsi="Times New Roman" w:cs="Times New Roman"/>
           <w:highlight w:val="white"/>
         </w:rPr>
-        <w:t xml:space="preserve"> </w:t>
-      </w:r>
-      <w:proofErr w:type="spellStart"/>
-      <w:r>
-        <w:rPr>
-          <w:rFonts w:ascii="Times New Roman" w:eastAsia="Times New Roman" w:hAnsi="Times New Roman" w:cs="Times New Roman"/>
-          <w:highlight w:val="white"/>
-        </w:rPr>
-        <w:t>MyTMMIN</w:t>
-      </w:r>
-      <w:proofErr w:type="spellEnd"/>
-      <w:r>
-        <w:rPr>
-          <w:rFonts w:ascii="Times New Roman" w:eastAsia="Times New Roman" w:hAnsi="Times New Roman" w:cs="Times New Roman"/>
-          <w:highlight w:val="white"/>
-        </w:rPr>
-        <w:t>)</w:t>
+        <w:t xml:space="preserve"> MyTMMIN)</w:t>
       </w:r>
     </w:p>
     <w:p>
@@ -815,27 +723,7 @@
           <w:sz w:val="24"/>
           <w:szCs w:val="24"/>
         </w:rPr>
-        <w:t xml:space="preserve">Software Engineer (Android), </w:t>
-      </w:r>
-      <w:proofErr w:type="spellStart"/>
-      <w:r>
-        <w:rPr>
-          <w:rFonts w:ascii="Times New Roman" w:eastAsia="Times New Roman" w:hAnsi="Times New Roman" w:cs="Times New Roman"/>
-          <w:b/>
-          <w:sz w:val="24"/>
-          <w:szCs w:val="24"/>
-        </w:rPr>
-        <w:t>Fishku</w:t>
-      </w:r>
-      <w:proofErr w:type="spellEnd"/>
-      <w:r>
-        <w:rPr>
-          <w:rFonts w:ascii="Times New Roman" w:eastAsia="Times New Roman" w:hAnsi="Times New Roman" w:cs="Times New Roman"/>
-          <w:b/>
-          <w:sz w:val="24"/>
-          <w:szCs w:val="24"/>
-        </w:rPr>
-        <w:t xml:space="preserve"> Indonesia</w:t>
+        <w:t>Software Engineer (Android), Fishku Indonesia</w:t>
       </w:r>
     </w:p>
     <w:p>
@@ -1060,7 +948,6 @@
         </w:rPr>
         <w:t xml:space="preserve">Mobile Developer Advisor, </w:t>
       </w:r>
-      <w:proofErr w:type="spellStart"/>
       <w:r>
         <w:rPr>
           <w:rFonts w:ascii="Times New Roman" w:eastAsia="Times New Roman" w:hAnsi="Times New Roman" w:cs="Times New Roman"/>
@@ -1068,37 +955,7 @@
           <w:sz w:val="22"/>
           <w:szCs w:val="22"/>
         </w:rPr>
-        <w:t>Bangkit</w:t>
-      </w:r>
-      <w:proofErr w:type="spellEnd"/>
-      <w:r>
-        <w:rPr>
-          <w:rFonts w:ascii="Times New Roman" w:eastAsia="Times New Roman" w:hAnsi="Times New Roman" w:cs="Times New Roman"/>
-          <w:b/>
-          <w:sz w:val="22"/>
-          <w:szCs w:val="22"/>
-        </w:rPr>
-        <w:t xml:space="preserve"> Academy led by Google, </w:t>
-      </w:r>
-      <w:proofErr w:type="spellStart"/>
-      <w:r>
-        <w:rPr>
-          <w:rFonts w:ascii="Times New Roman" w:eastAsia="Times New Roman" w:hAnsi="Times New Roman" w:cs="Times New Roman"/>
-          <w:b/>
-          <w:sz w:val="22"/>
-          <w:szCs w:val="22"/>
-        </w:rPr>
-        <w:t>GoTo</w:t>
-      </w:r>
-      <w:proofErr w:type="spellEnd"/>
-      <w:r>
-        <w:rPr>
-          <w:rFonts w:ascii="Times New Roman" w:eastAsia="Times New Roman" w:hAnsi="Times New Roman" w:cs="Times New Roman"/>
-          <w:b/>
-          <w:sz w:val="22"/>
-          <w:szCs w:val="22"/>
-        </w:rPr>
-        <w:t>, &amp; Traveloka</w:t>
+        <w:t>Bangkit Academy led by Google, GoTo, &amp; Traveloka</w:t>
       </w:r>
     </w:p>
     <w:p>
@@ -1170,6 +1027,7 @@
         <w:rPr>
           <w:rFonts w:ascii="Times New Roman" w:eastAsia="Times New Roman" w:hAnsi="Times New Roman" w:cs="Times New Roman"/>
         </w:rPr>
+        <w:lastRenderedPageBreak/>
         <w:t>Achieved a 5/5 performance rating, reflecting strong mentorship and project success.</w:t>
       </w:r>
     </w:p>
@@ -1185,7 +1043,6 @@
         <w:rPr>
           <w:rFonts w:ascii="Times New Roman" w:eastAsia="Times New Roman" w:hAnsi="Times New Roman" w:cs="Times New Roman"/>
         </w:rPr>
-        <w:lastRenderedPageBreak/>
         <w:t>Provided technical guidance and monitored team progress, offering strategic insights to overcome development challenges.</w:t>
       </w:r>
     </w:p>
@@ -1276,47 +1133,7 @@
           <w:sz w:val="24"/>
           <w:szCs w:val="24"/>
         </w:rPr>
-        <w:t xml:space="preserve">Mobile Developer Instructor, </w:t>
-      </w:r>
-      <w:proofErr w:type="spellStart"/>
-      <w:r>
-        <w:rPr>
-          <w:rFonts w:ascii="Times New Roman" w:eastAsia="Times New Roman" w:hAnsi="Times New Roman" w:cs="Times New Roman"/>
-          <w:b/>
-          <w:sz w:val="24"/>
-          <w:szCs w:val="24"/>
-        </w:rPr>
-        <w:t>Bangkit</w:t>
-      </w:r>
-      <w:proofErr w:type="spellEnd"/>
-      <w:r>
-        <w:rPr>
-          <w:rFonts w:ascii="Times New Roman" w:eastAsia="Times New Roman" w:hAnsi="Times New Roman" w:cs="Times New Roman"/>
-          <w:b/>
-          <w:sz w:val="24"/>
-          <w:szCs w:val="24"/>
-        </w:rPr>
-        <w:t xml:space="preserve"> Academy led by Google, </w:t>
-      </w:r>
-      <w:proofErr w:type="spellStart"/>
-      <w:r>
-        <w:rPr>
-          <w:rFonts w:ascii="Times New Roman" w:eastAsia="Times New Roman" w:hAnsi="Times New Roman" w:cs="Times New Roman"/>
-          <w:b/>
-          <w:sz w:val="24"/>
-          <w:szCs w:val="24"/>
-        </w:rPr>
-        <w:t>GoTo</w:t>
-      </w:r>
-      <w:proofErr w:type="spellEnd"/>
-      <w:r>
-        <w:rPr>
-          <w:rFonts w:ascii="Times New Roman" w:eastAsia="Times New Roman" w:hAnsi="Times New Roman" w:cs="Times New Roman"/>
-          <w:b/>
-          <w:sz w:val="24"/>
-          <w:szCs w:val="24"/>
-        </w:rPr>
-        <w:t>, &amp; Traveloka</w:t>
+        <w:t>Mobile Developer Instructor, Bangkit Academy led by Google, GoTo, &amp; Traveloka</w:t>
       </w:r>
     </w:p>
     <w:p>
@@ -1400,21 +1217,7 @@
         <w:rPr>
           <w:rFonts w:ascii="Times New Roman" w:eastAsia="Times New Roman" w:hAnsi="Times New Roman" w:cs="Times New Roman"/>
         </w:rPr>
-        <w:t xml:space="preserve">Selected as 1 of 300 Instructors from 442 applicants for </w:t>
-      </w:r>
-      <w:proofErr w:type="spellStart"/>
-      <w:r>
-        <w:rPr>
-          <w:rFonts w:ascii="Times New Roman" w:eastAsia="Times New Roman" w:hAnsi="Times New Roman" w:cs="Times New Roman"/>
-        </w:rPr>
-        <w:t>Bangkit</w:t>
-      </w:r>
-      <w:proofErr w:type="spellEnd"/>
-      <w:r>
-        <w:rPr>
-          <w:rFonts w:ascii="Times New Roman" w:eastAsia="Times New Roman" w:hAnsi="Times New Roman" w:cs="Times New Roman"/>
-        </w:rPr>
-        <w:t xml:space="preserve"> 2024, a prestigious tech education program.</w:t>
+        <w:t>Selected as 1 of 300 Instructors from 442 applicants for Bangkit 2024, a prestigious tech education program.</w:t>
       </w:r>
     </w:p>
     <w:p>
@@ -1661,7 +1464,7 @@
         <w:rPr>
           <w:noProof/>
         </w:rPr>
-        <w:pict w14:anchorId="25F724D9">
+        <w:pict w14:anchorId="3B87A4D2">
           <v:rect id="_x0000_i1027" alt="" style="width:467.45pt;height:.05pt;mso-width-percent:0;mso-height-percent:0;mso-width-percent:0;mso-height-percent:0" o:hralign="center" o:hrstd="t" o:hr="t" fillcolor="#a0a0a0" stroked="f"/>
         </w:pict>
       </w:r>
@@ -1693,47 +1496,7 @@
           <w:sz w:val="24"/>
           <w:szCs w:val="24"/>
         </w:rPr>
-        <w:t xml:space="preserve">Google Developer Groups on Campus Lead, UIN </w:t>
-      </w:r>
-      <w:proofErr w:type="spellStart"/>
-      <w:r>
-        <w:rPr>
-          <w:rFonts w:ascii="Times New Roman" w:eastAsia="Times New Roman" w:hAnsi="Times New Roman" w:cs="Times New Roman"/>
-          <w:b/>
-          <w:sz w:val="24"/>
-          <w:szCs w:val="24"/>
-        </w:rPr>
-        <w:t>Syarif</w:t>
-      </w:r>
-      <w:proofErr w:type="spellEnd"/>
-      <w:r>
-        <w:rPr>
-          <w:rFonts w:ascii="Times New Roman" w:eastAsia="Times New Roman" w:hAnsi="Times New Roman" w:cs="Times New Roman"/>
-          <w:b/>
-          <w:sz w:val="24"/>
-          <w:szCs w:val="24"/>
-        </w:rPr>
-        <w:t xml:space="preserve"> </w:t>
-      </w:r>
-      <w:proofErr w:type="spellStart"/>
-      <w:r>
-        <w:rPr>
-          <w:rFonts w:ascii="Times New Roman" w:eastAsia="Times New Roman" w:hAnsi="Times New Roman" w:cs="Times New Roman"/>
-          <w:b/>
-          <w:sz w:val="24"/>
-          <w:szCs w:val="24"/>
-        </w:rPr>
-        <w:t>Hidayatullah</w:t>
-      </w:r>
-      <w:proofErr w:type="spellEnd"/>
-      <w:r>
-        <w:rPr>
-          <w:rFonts w:ascii="Times New Roman" w:eastAsia="Times New Roman" w:hAnsi="Times New Roman" w:cs="Times New Roman"/>
-          <w:b/>
-          <w:sz w:val="24"/>
-          <w:szCs w:val="24"/>
-        </w:rPr>
-        <w:t xml:space="preserve"> Jakarta</w:t>
+        <w:t>Google Developer Groups on Campus Lead, UIN Syarif Hidayatullah Jakarta</w:t>
       </w:r>
     </w:p>
     <w:p>
@@ -1849,7 +1612,7 @@
         <w:rPr>
           <w:noProof/>
         </w:rPr>
-        <w:pict w14:anchorId="4CA8F447">
+        <w:pict w14:anchorId="53D82093">
           <v:rect id="_x0000_i1026" alt="" style="width:467.85pt;height:.05pt;mso-width-percent:0;mso-height-percent:0;mso-width-percent:0;mso-height-percent:0" o:hralign="center" o:hrstd="t" o:hr="t" fillcolor="#a0a0a0" stroked="f"/>
         </w:pict>
       </w:r>
@@ -2017,7 +1780,7 @@
         <w:rPr>
           <w:noProof/>
         </w:rPr>
-        <w:pict w14:anchorId="3C5214E7">
+        <w:pict w14:anchorId="5BBD399B">
           <v:rect id="_x0000_i1025" alt="" style="width:468pt;height:.05pt;mso-width-percent:0;mso-height-percent:0;mso-width-percent:0;mso-height-percent:0" o:hralign="center" o:hrstd="t" o:hr="t" fillcolor="#a0a0a0" stroked="f"/>
         </w:pict>
       </w:r>
@@ -2092,85 +1855,12 @@
           <w:b/>
         </w:rPr>
       </w:pPr>
-      <w:proofErr w:type="spellStart"/>
-      <w:r>
-        <w:rPr>
-          <w:rFonts w:ascii="Times New Roman" w:eastAsia="Times New Roman" w:hAnsi="Times New Roman" w:cs="Times New Roman"/>
-          <w:b/>
-        </w:rPr>
-        <w:t>Belajar</w:t>
-      </w:r>
-      <w:proofErr w:type="spellEnd"/>
-      <w:r>
-        <w:rPr>
-          <w:rFonts w:ascii="Times New Roman" w:eastAsia="Times New Roman" w:hAnsi="Times New Roman" w:cs="Times New Roman"/>
-          <w:b/>
-        </w:rPr>
-        <w:t xml:space="preserve"> </w:t>
-      </w:r>
-      <w:proofErr w:type="spellStart"/>
-      <w:r>
-        <w:rPr>
-          <w:rFonts w:ascii="Times New Roman" w:eastAsia="Times New Roman" w:hAnsi="Times New Roman" w:cs="Times New Roman"/>
-          <w:b/>
-        </w:rPr>
-        <w:t>Membuat</w:t>
-      </w:r>
-      <w:proofErr w:type="spellEnd"/>
-      <w:r>
-        <w:rPr>
-          <w:rFonts w:ascii="Times New Roman" w:eastAsia="Times New Roman" w:hAnsi="Times New Roman" w:cs="Times New Roman"/>
-          <w:b/>
-        </w:rPr>
-        <w:t xml:space="preserve"> </w:t>
-      </w:r>
-      <w:proofErr w:type="spellStart"/>
-      <w:r>
-        <w:rPr>
-          <w:rFonts w:ascii="Times New Roman" w:eastAsia="Times New Roman" w:hAnsi="Times New Roman" w:cs="Times New Roman"/>
-          <w:b/>
-        </w:rPr>
-        <w:t>Aplikasi</w:t>
-      </w:r>
-      <w:proofErr w:type="spellEnd"/>
-      <w:r>
-        <w:rPr>
-          <w:rFonts w:ascii="Times New Roman" w:eastAsia="Times New Roman" w:hAnsi="Times New Roman" w:cs="Times New Roman"/>
-          <w:b/>
-        </w:rPr>
-        <w:t xml:space="preserve"> Android </w:t>
-      </w:r>
-      <w:proofErr w:type="spellStart"/>
-      <w:r>
-        <w:rPr>
-          <w:rFonts w:ascii="Times New Roman" w:eastAsia="Times New Roman" w:hAnsi="Times New Roman" w:cs="Times New Roman"/>
-          <w:b/>
-        </w:rPr>
-        <w:t>dengan</w:t>
-      </w:r>
-      <w:proofErr w:type="spellEnd"/>
-      <w:r>
-        <w:rPr>
-          <w:rFonts w:ascii="Times New Roman" w:eastAsia="Times New Roman" w:hAnsi="Times New Roman" w:cs="Times New Roman"/>
-          <w:b/>
-        </w:rPr>
-        <w:t xml:space="preserve"> Jetpack Compose, </w:t>
-      </w:r>
-      <w:proofErr w:type="spellStart"/>
-      <w:r>
-        <w:rPr>
-          <w:rFonts w:ascii="Times New Roman" w:eastAsia="Times New Roman" w:hAnsi="Times New Roman" w:cs="Times New Roman"/>
-          <w:b/>
-        </w:rPr>
-        <w:t>Dicoding</w:t>
-      </w:r>
-      <w:proofErr w:type="spellEnd"/>
-      <w:r>
-        <w:rPr>
-          <w:rFonts w:ascii="Times New Roman" w:eastAsia="Times New Roman" w:hAnsi="Times New Roman" w:cs="Times New Roman"/>
-          <w:b/>
-        </w:rPr>
-        <w:t xml:space="preserve"> Indonesia</w:t>
+      <w:r>
+        <w:rPr>
+          <w:rFonts w:ascii="Times New Roman" w:eastAsia="Times New Roman" w:hAnsi="Times New Roman" w:cs="Times New Roman"/>
+          <w:b/>
+        </w:rPr>
+        <w:t>Belajar Membuat Aplikasi Android dengan Jetpack Compose, Dicoding Indonesia</w:t>
       </w:r>
     </w:p>
     <w:p>
@@ -2216,37 +1906,12 @@
           <w:b/>
         </w:rPr>
       </w:pPr>
-      <w:proofErr w:type="spellStart"/>
-      <w:r>
-        <w:rPr>
-          <w:rFonts w:ascii="Times New Roman" w:eastAsia="Times New Roman" w:hAnsi="Times New Roman" w:cs="Times New Roman"/>
-          <w:b/>
-        </w:rPr>
-        <w:t>Menjadi</w:t>
-      </w:r>
-      <w:proofErr w:type="spellEnd"/>
-      <w:r>
-        <w:rPr>
-          <w:rFonts w:ascii="Times New Roman" w:eastAsia="Times New Roman" w:hAnsi="Times New Roman" w:cs="Times New Roman"/>
-          <w:b/>
-        </w:rPr>
-        <w:t xml:space="preserve"> Android Developer Expert, </w:t>
-      </w:r>
-      <w:proofErr w:type="spellStart"/>
-      <w:r>
-        <w:rPr>
-          <w:rFonts w:ascii="Times New Roman" w:eastAsia="Times New Roman" w:hAnsi="Times New Roman" w:cs="Times New Roman"/>
-          <w:b/>
-        </w:rPr>
-        <w:t>Dicoding</w:t>
-      </w:r>
-      <w:proofErr w:type="spellEnd"/>
-      <w:r>
-        <w:rPr>
-          <w:rFonts w:ascii="Times New Roman" w:eastAsia="Times New Roman" w:hAnsi="Times New Roman" w:cs="Times New Roman"/>
-          <w:b/>
-        </w:rPr>
-        <w:t xml:space="preserve"> Indonesia</w:t>
+      <w:r>
+        <w:rPr>
+          <w:rFonts w:ascii="Times New Roman" w:eastAsia="Times New Roman" w:hAnsi="Times New Roman" w:cs="Times New Roman"/>
+          <w:b/>
+        </w:rPr>
+        <w:t>Menjadi Android Developer Expert, Dicoding Indonesia</w:t>
       </w:r>
     </w:p>
     <w:p>
@@ -2292,37 +1957,12 @@
           <w:b/>
         </w:rPr>
       </w:pPr>
-      <w:proofErr w:type="spellStart"/>
-      <w:r>
-        <w:rPr>
-          <w:rFonts w:ascii="Times New Roman" w:eastAsia="Times New Roman" w:hAnsi="Times New Roman" w:cs="Times New Roman"/>
-          <w:b/>
-        </w:rPr>
-        <w:t>Belajar</w:t>
-      </w:r>
-      <w:proofErr w:type="spellEnd"/>
-      <w:r>
-        <w:rPr>
-          <w:rFonts w:ascii="Times New Roman" w:eastAsia="Times New Roman" w:hAnsi="Times New Roman" w:cs="Times New Roman"/>
-          <w:b/>
-        </w:rPr>
-        <w:t xml:space="preserve"> Dasar UX Design, </w:t>
-      </w:r>
-      <w:proofErr w:type="spellStart"/>
-      <w:r>
-        <w:rPr>
-          <w:rFonts w:ascii="Times New Roman" w:eastAsia="Times New Roman" w:hAnsi="Times New Roman" w:cs="Times New Roman"/>
-          <w:b/>
-        </w:rPr>
-        <w:t>Dicoding</w:t>
-      </w:r>
-      <w:proofErr w:type="spellEnd"/>
-      <w:r>
-        <w:rPr>
-          <w:rFonts w:ascii="Times New Roman" w:eastAsia="Times New Roman" w:hAnsi="Times New Roman" w:cs="Times New Roman"/>
-          <w:b/>
-        </w:rPr>
-        <w:t xml:space="preserve"> Indonesia</w:t>
+      <w:r>
+        <w:rPr>
+          <w:rFonts w:ascii="Times New Roman" w:eastAsia="Times New Roman" w:hAnsi="Times New Roman" w:cs="Times New Roman"/>
+          <w:b/>
+        </w:rPr>
+        <w:t>Belajar Dasar UX Design, Dicoding Indonesia</w:t>
       </w:r>
     </w:p>
     <w:p>
@@ -2373,39 +2013,7 @@
           <w:rFonts w:ascii="Times New Roman" w:eastAsia="Times New Roman" w:hAnsi="Times New Roman" w:cs="Times New Roman"/>
           <w:b/>
         </w:rPr>
-        <w:t xml:space="preserve">Mobile Development (Android) Cohort </w:t>
-      </w:r>
-      <w:proofErr w:type="spellStart"/>
-      <w:r>
-        <w:rPr>
-          <w:rFonts w:ascii="Times New Roman" w:eastAsia="Times New Roman" w:hAnsi="Times New Roman" w:cs="Times New Roman"/>
-          <w:b/>
-        </w:rPr>
-        <w:t>Bangkit</w:t>
-      </w:r>
-      <w:proofErr w:type="spellEnd"/>
-      <w:r>
-        <w:rPr>
-          <w:rFonts w:ascii="Times New Roman" w:eastAsia="Times New Roman" w:hAnsi="Times New Roman" w:cs="Times New Roman"/>
-          <w:b/>
-        </w:rPr>
-        <w:t xml:space="preserve"> Academy led by Google, </w:t>
-      </w:r>
-      <w:proofErr w:type="spellStart"/>
-      <w:r>
-        <w:rPr>
-          <w:rFonts w:ascii="Times New Roman" w:eastAsia="Times New Roman" w:hAnsi="Times New Roman" w:cs="Times New Roman"/>
-          <w:b/>
-        </w:rPr>
-        <w:t>GoTo</w:t>
-      </w:r>
-      <w:proofErr w:type="spellEnd"/>
-      <w:r>
-        <w:rPr>
-          <w:rFonts w:ascii="Times New Roman" w:eastAsia="Times New Roman" w:hAnsi="Times New Roman" w:cs="Times New Roman"/>
-          <w:b/>
-        </w:rPr>
-        <w:t>, &amp; Traveloka</w:t>
+        <w:t>Mobile Development (Android) Cohort Bangkit Academy led by Google, GoTo, &amp; Traveloka</w:t>
       </w:r>
     </w:p>
     <w:p>
@@ -2450,7 +2058,7 @@
 </file>
 
 <file path=word/numbering.xml><?xml version="1.0" encoding="utf-8"?>
-<w:numbering xmlns:wpc="http://schemas.microsoft.com/office/word/2010/wordprocessingCanvas" xmlns:cx="http://schemas.microsoft.com/office/drawing/2014/chartex" xmlns:cx1="http://schemas.microsoft.com/office/drawing/2015/9/8/chartex" xmlns:cx2="http://schemas.microsoft.com/office/drawing/2015/10/21/chartex" xmlns:cx3="http://schemas.microsoft.com/office/drawing/2016/5/9/chartex" xmlns:cx4="http://schemas.microsoft.com/office/drawing/2016/5/10/chartex" xmlns:cx5="http://schemas.microsoft.com/office/drawing/2016/5/11/chartex" xmlns:cx6="http://schemas.microsoft.com/office/drawing/2016/5/12/chartex" xmlns:cx7="http://schemas.microsoft.com/office/drawing/2016/5/13/chartex" xmlns:cx8="http://schemas.microsoft.com/office/drawing/2016/5/14/chartex" xmlns:mc="http://schemas.openxmlformats.org/markup-compatibility/2006" xmlns:aink="http://schemas.microsoft.com/office/drawing/2016/ink" xmlns:am3d="http://schemas.microsoft.com/office/drawing/2017/model3d" xmlns:o="urn:schemas-microsoft-com:office:office" xmlns:oel="http://schemas.microsoft.com/office/2019/extlst" xmlns:r="http://schemas.openxmlformats.org/officeDocument/2006/relationships" xmlns:m="http://schemas.openxmlformats.org/officeDocument/2006/math" xmlns:v="urn:schemas-microsoft-com:vml" xmlns:wp14="http://schemas.microsoft.com/office/word/2010/wordprocessingDrawing" xmlns:wp="http://schemas.openxmlformats.org/drawingml/2006/wordprocessingDrawing" xmlns:w10="urn:schemas-microsoft-com:office:word" xmlns:w="http://schemas.openxmlformats.org/wordprocessingml/2006/main" xmlns:w14="http://schemas.microsoft.com/office/word/2010/wordml" xmlns:w15="http://schemas.microsoft.com/office/word/2012/wordml" xmlns:w16cex="http://schemas.microsoft.com/office/word/2018/wordml/cex" xmlns:w16cid="http://schemas.microsoft.com/office/word/2016/wordml/cid" xmlns:w16="http://schemas.microsoft.com/office/word/2018/wordml" xmlns:w16sdtdh="http://schemas.microsoft.com/office/word/2020/wordml/sdtdatahash" xmlns:w16se="http://schemas.microsoft.com/office/word/2015/wordml/symex" xmlns:wpg="http://schemas.microsoft.com/office/word/2010/wordprocessingGroup" xmlns:wpi="http://schemas.microsoft.com/office/word/2010/wordprocessingInk" xmlns:wne="http://schemas.microsoft.com/office/word/2006/wordml" xmlns:wps="http://schemas.microsoft.com/office/word/2010/wordprocessingShape" mc:Ignorable="w14 w15 w16se w16cid w16 w16cex w16sdtdh wp14">
+<w:numbering xmlns:wpc="http://schemas.microsoft.com/office/word/2010/wordprocessingCanvas" xmlns:cx="http://schemas.microsoft.com/office/drawing/2014/chartex" xmlns:cx1="http://schemas.microsoft.com/office/drawing/2015/9/8/chartex" xmlns:cx2="http://schemas.microsoft.com/office/drawing/2015/10/21/chartex" xmlns:cx3="http://schemas.microsoft.com/office/drawing/2016/5/9/chartex" xmlns:cx4="http://schemas.microsoft.com/office/drawing/2016/5/10/chartex" xmlns:cx5="http://schemas.microsoft.com/office/drawing/2016/5/11/chartex" xmlns:cx6="http://schemas.microsoft.com/office/drawing/2016/5/12/chartex" xmlns:cx7="http://schemas.microsoft.com/office/drawing/2016/5/13/chartex" xmlns:cx8="http://schemas.microsoft.com/office/drawing/2016/5/14/chartex" xmlns:mc="http://schemas.openxmlformats.org/markup-compatibility/2006" xmlns:aink="http://schemas.microsoft.com/office/drawing/2016/ink" xmlns:am3d="http://schemas.microsoft.com/office/drawing/2017/model3d" xmlns:o="urn:schemas-microsoft-com:office:office" xmlns:oel="http://schemas.microsoft.com/office/2019/extlst" xmlns:r="http://schemas.openxmlformats.org/officeDocument/2006/relationships" xmlns:m="http://schemas.openxmlformats.org/officeDocument/2006/math" xmlns:v="urn:schemas-microsoft-com:vml" xmlns:wp14="http://schemas.microsoft.com/office/word/2010/wordprocessingDrawing" xmlns:wp="http://schemas.openxmlformats.org/drawingml/2006/wordprocessingDrawing" xmlns:w10="urn:schemas-microsoft-com:office:word" xmlns:w="http://schemas.openxmlformats.org/wordprocessingml/2006/main" xmlns:w14="http://schemas.microsoft.com/office/word/2010/wordml" xmlns:w15="http://schemas.microsoft.com/office/word/2012/wordml" xmlns:w16cex="http://schemas.microsoft.com/office/word/2018/wordml/cex" xmlns:w16cid="http://schemas.microsoft.com/office/word/2016/wordml/cid" xmlns:w16="http://schemas.microsoft.com/office/word/2018/wordml" xmlns:w16du="http://schemas.microsoft.com/office/word/2023/wordml/word16du" xmlns:w16sdtdh="http://schemas.microsoft.com/office/word/2020/wordml/sdtdatahash" xmlns:w16sdtfl="http://schemas.microsoft.com/office/word/2024/wordml/sdtformatlock" xmlns:w16se="http://schemas.microsoft.com/office/word/2015/wordml/symex" xmlns:wpg="http://schemas.microsoft.com/office/word/2010/wordprocessingGroup" xmlns:wpi="http://schemas.microsoft.com/office/word/2010/wordprocessingInk" xmlns:wne="http://schemas.microsoft.com/office/word/2006/wordml" xmlns:wps="http://schemas.microsoft.com/office/word/2010/wordprocessingShape" mc:Ignorable="w14 w15 w16se w16cid w16 w16cex w16sdtdh w16sdtfl w16du wp14">
   <w:abstractNum w:abstractNumId="0" w15:restartNumberingAfterBreak="0">
     <w:nsid w:val="10BB08EC"/>
     <w:multiLevelType w:val="multilevel"/>
@@ -3151,7 +2759,7 @@
 </file>
 
 <file path=word/styles.xml><?xml version="1.0" encoding="utf-8"?>
-<w:styles xmlns:mc="http://schemas.openxmlformats.org/markup-compatibility/2006" xmlns:r="http://schemas.openxmlformats.org/officeDocument/2006/relationships" xmlns:w="http://schemas.openxmlformats.org/wordprocessingml/2006/main" xmlns:w14="http://schemas.microsoft.com/office/word/2010/wordml" xmlns:w15="http://schemas.microsoft.com/office/word/2012/wordml" xmlns:w16cex="http://schemas.microsoft.com/office/word/2018/wordml/cex" xmlns:w16cid="http://schemas.microsoft.com/office/word/2016/wordml/cid" xmlns:w16="http://schemas.microsoft.com/office/word/2018/wordml" xmlns:w16sdtdh="http://schemas.microsoft.com/office/word/2020/wordml/sdtdatahash" xmlns:w16se="http://schemas.microsoft.com/office/word/2015/wordml/symex" mc:Ignorable="w14 w15 w16se w16cid w16 w16cex w16sdtdh">
+<w:styles xmlns:mc="http://schemas.openxmlformats.org/markup-compatibility/2006" xmlns:r="http://schemas.openxmlformats.org/officeDocument/2006/relationships" xmlns:w="http://schemas.openxmlformats.org/wordprocessingml/2006/main" xmlns:w14="http://schemas.microsoft.com/office/word/2010/wordml" xmlns:w15="http://schemas.microsoft.com/office/word/2012/wordml" xmlns:w16cex="http://schemas.microsoft.com/office/word/2018/wordml/cex" xmlns:w16cid="http://schemas.microsoft.com/office/word/2016/wordml/cid" xmlns:w16="http://schemas.microsoft.com/office/word/2018/wordml" xmlns:w16du="http://schemas.microsoft.com/office/word/2023/wordml/word16du" xmlns:w16sdtdh="http://schemas.microsoft.com/office/word/2020/wordml/sdtdatahash" xmlns:w16sdtfl="http://schemas.microsoft.com/office/word/2024/wordml/sdtformatlock" xmlns:w16se="http://schemas.microsoft.com/office/word/2015/wordml/symex" mc:Ignorable="w14 w15 w16se w16cid w16 w16cex w16sdtdh w16sdtfl w16du">
   <w:docDefaults>
     <w:rPrDefault>
       <w:rPr>

</xml_diff>

<commit_message>
feat(resume): update desc danamon
</commit_message>
<xml_diff>
--- a/Fachridan Tio Mu'afa_CV (Android).docx
+++ b/Fachridan Tio Mu'afa_CV (Android).docx
@@ -97,13 +97,8 @@
         </w:r>
       </w:hyperlink>
       <w:r>
-        <w:rPr>
-          <w:noProof/>
-        </w:rPr>
-      </w:r>
-      <w:r>
-        <w:pict w14:anchorId="17108938">
-          <v:rect id="Horizontal Line 1" o:spid="_x0000_s1031" style="width:536pt;height:.05pt;visibility:visible;mso-wrap-style:square;mso-left-percent:-10001;mso-top-percent:-10001;mso-position-horizontal:absolute;mso-position-horizontal-relative:char;mso-position-vertical:absolute;mso-position-vertical-relative:line;mso-left-percent:-10001;mso-top-percent:-10001;v-text-anchor:top" o:gfxdata="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" filled="f">
+        <w:pict w14:anchorId="42AD3ABA">
+          <v:rect id="Horizontal Line 1" o:spid="_x0000_s1031" alt="" style="width:536pt;height:.05pt;visibility:visible;mso-wrap-style:square;mso-width-percent:0;mso-height-percent:0;mso-left-percent:-10001;mso-top-percent:-10001;mso-position-horizontal:absolute;mso-position-horizontal-relative:char;mso-position-vertical:absolute;mso-position-vertical-relative:line;mso-width-percent:0;mso-height-percent:0;mso-left-percent:-10001;mso-top-percent:-10001;v-text-anchor:top" filled="f">
             <o:lock v:ext="edit" rotation="t" aspectratio="t" verticies="t" text="t" shapetype="t"/>
             <w10:anchorlock/>
           </v:rect>
@@ -177,13 +172,8 @@
         </w:rPr>
       </w:pPr>
       <w:r>
-        <w:rPr>
-          <w:noProof/>
-        </w:rPr>
-      </w:r>
-      <w:r>
-        <w:pict w14:anchorId="642F44D9">
-          <v:rect id="Horizontal Line 2" o:spid="_x0000_s1030" style="width:539pt;height:.05pt;visibility:visible;mso-wrap-style:square;mso-left-percent:-10001;mso-top-percent:-10001;mso-position-horizontal:absolute;mso-position-horizontal-relative:char;mso-position-vertical:absolute;mso-position-vertical-relative:line;mso-left-percent:-10001;mso-top-percent:-10001;v-text-anchor:top" o:gfxdata="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" filled="f">
+        <w:pict w14:anchorId="782E826D">
+          <v:rect id="Horizontal Line 2" o:spid="_x0000_s1030" alt="" style="width:539pt;height:.05pt;visibility:visible;mso-wrap-style:square;mso-width-percent:0;mso-height-percent:0;mso-left-percent:-10001;mso-top-percent:-10001;mso-position-horizontal:absolute;mso-position-horizontal-relative:char;mso-position-vertical:absolute;mso-position-vertical-relative:line;mso-width-percent:0;mso-height-percent:0;mso-left-percent:-10001;mso-top-percent:-10001;v-text-anchor:top" filled="f">
             <o:lock v:ext="edit" rotation="t" aspectratio="t" verticies="t" text="t" shapetype="t"/>
             <w10:anchorlock/>
           </v:rect>
@@ -347,13 +337,8 @@
         </w:rPr>
       </w:pPr>
       <w:r>
-        <w:rPr>
-          <w:noProof/>
-        </w:rPr>
-      </w:r>
-      <w:r>
-        <w:pict w14:anchorId="25E08DD0">
-          <v:rect id="Horizontal Line 3" o:spid="_x0000_s1029" style="width:544.4pt;height:.05pt;visibility:visible;mso-wrap-style:square;mso-left-percent:-10001;mso-top-percent:-10001;mso-position-horizontal:absolute;mso-position-horizontal-relative:char;mso-position-vertical:absolute;mso-position-vertical-relative:line;mso-left-percent:-10001;mso-top-percent:-10001;v-text-anchor:top" o:gfxdata="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" filled="f">
+        <w:pict w14:anchorId="0F4173DA">
+          <v:rect id="Horizontal Line 3" o:spid="_x0000_s1029" alt="" style="width:544.4pt;height:.05pt;visibility:visible;mso-wrap-style:square;mso-width-percent:0;mso-height-percent:0;mso-left-percent:-10001;mso-top-percent:-10001;mso-position-horizontal:absolute;mso-position-horizontal-relative:char;mso-position-vertical:absolute;mso-position-vertical-relative:line;mso-width-percent:0;mso-height-percent:0;mso-left-percent:-10001;mso-top-percent:-10001;v-text-anchor:top" filled="f">
             <o:lock v:ext="edit" rotation="t" aspectratio="t" verticies="t" text="t" shapetype="t"/>
             <w10:anchorlock/>
           </v:rect>
@@ -426,26 +411,6 @@
           <w:szCs w:val="24"/>
         </w:rPr>
         <w:t xml:space="preserve">Jakarta, June 2024 – Present </w:t>
-      </w:r>
-    </w:p>
-    <w:p>
-      <w:pPr>
-        <w:widowControl w:val="0"/>
-        <w:numPr>
-          <w:ilvl w:val="0"/>
-          <w:numId w:val="5"/>
-        </w:numPr>
-        <w:spacing w:before="36"/>
-        <w:ind w:right="334"/>
-        <w:rPr>
-          <w:rFonts w:ascii="Times New Roman" w:hAnsi="Times New Roman" w:cs="Times New Roman"/>
-        </w:rPr>
-      </w:pPr>
-      <w:r>
-        <w:rPr>
-          <w:rFonts w:ascii="Times New Roman" w:hAnsi="Times New Roman" w:cs="Times New Roman"/>
-        </w:rPr>
-        <w:t>Placed at PT. Bank Danamon Indonesia, Tbk. to contribute to key Android mobile banking projects.</w:t>
       </w:r>
     </w:p>
     <w:p>
@@ -455,17 +420,33 @@
           <w:ilvl w:val="0"/>
           <w:numId w:val="5"/>
         </w:numPr>
-        <w:rPr>
+        <w:spacing w:before="0" w:beforeAutospacing="0"/>
+        <w:rPr>
+          <w:rFonts w:eastAsia="Arial"/>
           <w:sz w:val="22"/>
           <w:szCs w:val="22"/>
-        </w:rPr>
-      </w:pPr>
-      <w:r>
-        <w:rPr>
+          <w:lang w:val="en"/>
+        </w:rPr>
+      </w:pPr>
+      <w:r>
+        <w:rPr>
+          <w:rFonts w:eastAsia="Arial"/>
+          <w:b/>
+          <w:bCs/>
           <w:sz w:val="22"/>
           <w:szCs w:val="22"/>
-        </w:rPr>
-        <w:t>Introduced QRIS for both domestic and international transactions to enhance digital payment accessibility.</w:t>
+          <w:lang w:val="en"/>
+        </w:rPr>
+        <w:t>Architected Mobile Isolation for D-Bank PRO Bisnis (SME)</w:t>
+      </w:r>
+      <w:r>
+        <w:rPr>
+          <w:rFonts w:eastAsia="Arial"/>
+          <w:sz w:val="22"/>
+          <w:szCs w:val="22"/>
+          <w:lang w:val="en"/>
+        </w:rPr>
+        <w:t>: Successfully engineered the structural foundation to cleanly isolate the new SME platform code from the existing "D-Bank PRO Personal" codebase. Designed the new SME dashboard, core functions, and a dedicated network isolation layer, creating a bug-free production release with zero regression or impact on the Personal side.</w:t>
       </w:r>
     </w:p>
     <w:p>
@@ -476,16 +457,31 @@
           <w:numId w:val="5"/>
         </w:numPr>
         <w:rPr>
+          <w:rFonts w:eastAsia="Arial"/>
           <w:sz w:val="22"/>
           <w:szCs w:val="22"/>
-        </w:rPr>
-      </w:pPr>
-      <w:r>
-        <w:rPr>
+          <w:lang w:val="en"/>
+        </w:rPr>
+      </w:pPr>
+      <w:r>
+        <w:rPr>
+          <w:rFonts w:eastAsia="Arial"/>
+          <w:b/>
+          <w:bCs/>
           <w:sz w:val="22"/>
           <w:szCs w:val="22"/>
-        </w:rPr>
-        <w:t>Expanded user payment options by developing and integrating mobile credit/data top-up, Telkom Pay, and PLN postpaid and biller services.</w:t>
+          <w:lang w:val="en"/>
+        </w:rPr>
+        <w:t xml:space="preserve">Pioneered Server-Driven UI (SmartUI Framework): </w:t>
+      </w:r>
+      <w:r>
+        <w:rPr>
+          <w:rFonts w:eastAsia="Arial"/>
+          <w:sz w:val="22"/>
+          <w:szCs w:val="22"/>
+          <w:lang w:val="en"/>
+        </w:rPr>
+        <w:t>Developed and maintained the foundational architecture of SmartUI, enabling rapid scale from a single component to 26 production-ready biller features (including Top Up, Telkompay, PLN Prepaid/Postpaid). This successfully decoupled UI components from rigid app release cycles, accelerating feature deployment velocity.</w:t>
       </w:r>
     </w:p>
     <w:p>
@@ -496,16 +492,31 @@
           <w:numId w:val="5"/>
         </w:numPr>
         <w:rPr>
+          <w:rFonts w:eastAsia="Arial"/>
           <w:sz w:val="22"/>
           <w:szCs w:val="22"/>
-        </w:rPr>
-      </w:pPr>
-      <w:r>
-        <w:rPr>
+          <w:lang w:val="en"/>
+        </w:rPr>
+      </w:pPr>
+      <w:r>
+        <w:rPr>
+          <w:rFonts w:eastAsia="Arial"/>
+          <w:b/>
+          <w:bCs/>
           <w:sz w:val="22"/>
           <w:szCs w:val="22"/>
-        </w:rPr>
-        <w:t>Launched a cardless cash withdrawal feature, allowing users to withdraw cash at Danamon ATMs and partner merchants.</w:t>
+          <w:lang w:val="en"/>
+        </w:rPr>
+        <w:t>Engineered High-Volume QRIS Foundations</w:t>
+      </w:r>
+      <w:r>
+        <w:rPr>
+          <w:rFonts w:eastAsia="Arial"/>
+          <w:sz w:val="22"/>
+          <w:szCs w:val="22"/>
+          <w:lang w:val="en"/>
+        </w:rPr>
+        <w:t>: Designed and delivered the core architecture for both Local and Cross-border QRIS MPM Payments. The feature launched smoothly with minimal production bugs, directly driving user acquisition and rapidly positioning itself as one of the top payment transaction channels on D-Bank PRO.</w:t>
       </w:r>
     </w:p>
     <w:p>
@@ -516,16 +527,31 @@
           <w:numId w:val="5"/>
         </w:numPr>
         <w:rPr>
+          <w:rFonts w:eastAsia="Arial"/>
           <w:sz w:val="22"/>
           <w:szCs w:val="22"/>
-        </w:rPr>
-      </w:pPr>
-      <w:r>
-        <w:rPr>
+          <w:lang w:val="en"/>
+        </w:rPr>
+      </w:pPr>
+      <w:r>
+        <w:rPr>
+          <w:rFonts w:eastAsia="Arial"/>
+          <w:b/>
+          <w:bCs/>
           <w:sz w:val="22"/>
           <w:szCs w:val="22"/>
-        </w:rPr>
-        <w:t>Optimized UI development by pioneering the adoption of Jetpack Compose with bottom sheet flows and server-driven UI components.</w:t>
+          <w:lang w:val="en"/>
+        </w:rPr>
+        <w:t>Co-Led DevX Platform Initiatives:</w:t>
+      </w:r>
+      <w:r>
+        <w:rPr>
+          <w:rFonts w:eastAsia="Arial"/>
+          <w:sz w:val="22"/>
+          <w:szCs w:val="22"/>
+          <w:lang w:val="en"/>
+        </w:rPr>
+        <w:t xml:space="preserve"> Integrated directly into the core Developer Experience (DevX) squad, taking on deep operational responsibility to maintain app health, optimize developer workflows, and ensure robust delivery across engineering teams.</w:t>
       </w:r>
     </w:p>
     <w:p>
@@ -536,77 +562,31 @@
           <w:numId w:val="5"/>
         </w:numPr>
         <w:rPr>
+          <w:rFonts w:eastAsia="Arial"/>
           <w:sz w:val="22"/>
           <w:szCs w:val="22"/>
-        </w:rPr>
-      </w:pPr>
-      <w:r>
-        <w:rPr>
+          <w:lang w:val="en"/>
+        </w:rPr>
+      </w:pPr>
+      <w:r>
+        <w:rPr>
+          <w:rFonts w:eastAsia="Arial"/>
+          <w:b/>
+          <w:bCs/>
           <w:sz w:val="22"/>
           <w:szCs w:val="22"/>
-        </w:rPr>
-        <w:t>Collaborate cross-functionally with DevX, UI/UX, backend, and solution architects to ensure seamless feature integration.</w:t>
-      </w:r>
-    </w:p>
-    <w:p>
-      <w:pPr>
-        <w:pStyle w:val="NormalWeb"/>
-        <w:numPr>
-          <w:ilvl w:val="0"/>
-          <w:numId w:val="5"/>
-        </w:numPr>
-        <w:rPr>
+          <w:lang w:val="en"/>
+        </w:rPr>
+        <w:t>Core Framework Custodian:</w:t>
+      </w:r>
+      <w:r>
+        <w:rPr>
+          <w:rFonts w:eastAsia="Arial"/>
           <w:sz w:val="22"/>
           <w:szCs w:val="22"/>
-        </w:rPr>
-      </w:pPr>
-      <w:r>
-        <w:rPr>
-          <w:sz w:val="22"/>
-          <w:szCs w:val="22"/>
-        </w:rPr>
-        <w:t>Architected and implemented a modular foundation to seamlessly decouple Personal and Business roles within the unified D-Bank PRO 2.0 app, establishing an extensible framework reused across multiple cross-functional feature teams.</w:t>
-      </w:r>
-    </w:p>
-    <w:p>
-      <w:pPr>
-        <w:pStyle w:val="NormalWeb"/>
-        <w:numPr>
-          <w:ilvl w:val="0"/>
-          <w:numId w:val="5"/>
-        </w:numPr>
-        <w:rPr>
-          <w:sz w:val="22"/>
-          <w:szCs w:val="22"/>
-        </w:rPr>
-      </w:pPr>
-      <w:r>
-        <w:rPr>
-          <w:sz w:val="22"/>
-          <w:szCs w:val="22"/>
-        </w:rPr>
-        <w:t>Engineered core enterprise capabilities for the SME (Small and Medium Enterprises) segment, driving the end-to-end development of the "D-Bank PRO Bisnis" dashboard, payroll processing systems, and high-volume business transactions.</w:t>
-      </w:r>
-    </w:p>
-    <w:p>
-      <w:pPr>
-        <w:pStyle w:val="NormalWeb"/>
-        <w:numPr>
-          <w:ilvl w:val="0"/>
-          <w:numId w:val="5"/>
-        </w:numPr>
-        <w:rPr>
-          <w:b/>
-          <w:sz w:val="22"/>
-          <w:szCs w:val="22"/>
-        </w:rPr>
-      </w:pPr>
-      <w:r>
-        <w:rPr>
-          <w:sz w:val="22"/>
-          <w:szCs w:val="22"/>
-        </w:rPr>
-        <w:t>Spearheaded the integration of critical credit and corporate features, including the Kredit Rekening Koran (KRK) module and a robust, secure individual business registration and management workflow.</w:t>
+          <w:lang w:val="en"/>
+        </w:rPr>
+        <w:t xml:space="preserve"> Directly responsible for maintaining and evolving critical platform foundations-including core application functions, global networking layers, Lighthouse components, and the foundational SmartUI architecture-to safeguard baseline system stability.</w:t>
       </w:r>
     </w:p>
     <w:p>
@@ -624,8 +604,6 @@
           <w:szCs w:val="24"/>
         </w:rPr>
       </w:pPr>
-      <w:bookmarkStart w:id="2" w:name="_4j0klthk3593" w:colFirst="0" w:colLast="0"/>
-      <w:bookmarkEnd w:id="2"/>
       <w:r>
         <w:rPr>
           <w:rFonts w:ascii="Times New Roman" w:eastAsia="Times New Roman" w:hAnsi="Times New Roman" w:cs="Times New Roman"/>
@@ -669,8 +647,8 @@
           <w:szCs w:val="24"/>
         </w:rPr>
       </w:pPr>
-      <w:bookmarkStart w:id="3" w:name="_b3egfu31l5n1" w:colFirst="0" w:colLast="0"/>
-      <w:bookmarkEnd w:id="3"/>
+      <w:bookmarkStart w:id="2" w:name="_b3egfu31l5n1" w:colFirst="0" w:colLast="0"/>
+      <w:bookmarkEnd w:id="2"/>
       <w:r>
         <w:rPr>
           <w:rFonts w:ascii="Times New Roman" w:eastAsia="Times New Roman" w:hAnsi="Times New Roman" w:cs="Times New Roman"/>
@@ -768,6 +746,8 @@
           <w:szCs w:val="24"/>
         </w:rPr>
       </w:pPr>
+      <w:bookmarkStart w:id="3" w:name="_2ehs4vmok4wl" w:colFirst="0" w:colLast="0"/>
+      <w:bookmarkEnd w:id="3"/>
     </w:p>
     <w:p>
       <w:pPr>
@@ -784,8 +764,6 @@
           <w:szCs w:val="24"/>
         </w:rPr>
       </w:pPr>
-      <w:bookmarkStart w:id="4" w:name="_2ehs4vmok4wl" w:colFirst="0" w:colLast="0"/>
-      <w:bookmarkEnd w:id="4"/>
       <w:r>
         <w:rPr>
           <w:rFonts w:ascii="Times New Roman" w:eastAsia="Times New Roman" w:hAnsi="Times New Roman" w:cs="Times New Roman"/>
@@ -811,8 +789,8 @@
           <w:szCs w:val="24"/>
         </w:rPr>
       </w:pPr>
-      <w:bookmarkStart w:id="5" w:name="_am6slxakusxv" w:colFirst="0" w:colLast="0"/>
-      <w:bookmarkEnd w:id="5"/>
+      <w:bookmarkStart w:id="4" w:name="_am6slxakusxv" w:colFirst="0" w:colLast="0"/>
+      <w:bookmarkEnd w:id="4"/>
       <w:r>
         <w:rPr>
           <w:rFonts w:ascii="Times New Roman" w:eastAsia="Times New Roman" w:hAnsi="Times New Roman" w:cs="Times New Roman"/>
@@ -990,8 +968,8 @@
           <w:szCs w:val="24"/>
         </w:rPr>
       </w:pPr>
-      <w:bookmarkStart w:id="6" w:name="_yy5mdbaxjtec" w:colFirst="0" w:colLast="0"/>
-      <w:bookmarkEnd w:id="6"/>
+      <w:bookmarkStart w:id="5" w:name="_yy5mdbaxjtec" w:colFirst="0" w:colLast="0"/>
+      <w:bookmarkEnd w:id="5"/>
     </w:p>
     <w:p>
       <w:pPr>
@@ -1008,8 +986,8 @@
           <w:szCs w:val="24"/>
         </w:rPr>
       </w:pPr>
-      <w:bookmarkStart w:id="7" w:name="_u69z0cn0ycmj" w:colFirst="0" w:colLast="0"/>
-      <w:bookmarkEnd w:id="7"/>
+      <w:bookmarkStart w:id="6" w:name="_u69z0cn0ycmj" w:colFirst="0" w:colLast="0"/>
+      <w:bookmarkEnd w:id="6"/>
       <w:r>
         <w:rPr>
           <w:rFonts w:ascii="Times New Roman" w:eastAsia="Times New Roman" w:hAnsi="Times New Roman" w:cs="Times New Roman"/>
@@ -1176,8 +1154,8 @@
           <w:szCs w:val="24"/>
         </w:rPr>
       </w:pPr>
-      <w:bookmarkStart w:id="8" w:name="_31rp7ocx00mt" w:colFirst="0" w:colLast="0"/>
-      <w:bookmarkEnd w:id="8"/>
+      <w:bookmarkStart w:id="7" w:name="_31rp7ocx00mt" w:colFirst="0" w:colLast="0"/>
+      <w:bookmarkEnd w:id="7"/>
     </w:p>
     <w:p>
       <w:pPr>
@@ -1194,8 +1172,8 @@
           <w:szCs w:val="24"/>
         </w:rPr>
       </w:pPr>
-      <w:bookmarkStart w:id="9" w:name="_ypzwpxoc9whq" w:colFirst="0" w:colLast="0"/>
-      <w:bookmarkEnd w:id="9"/>
+      <w:bookmarkStart w:id="8" w:name="_ypzwpxoc9whq" w:colFirst="0" w:colLast="0"/>
+      <w:bookmarkEnd w:id="8"/>
       <w:r>
         <w:rPr>
           <w:rFonts w:ascii="Times New Roman" w:eastAsia="Times New Roman" w:hAnsi="Times New Roman" w:cs="Times New Roman"/>
@@ -1385,8 +1363,8 @@
         <w:t>Earned a 4.72/5 performance rating for delivering 5 impactful sessions with engaging instruction.</w:t>
       </w:r>
     </w:p>
-    <w:bookmarkStart w:id="10" w:name="_98ru8atqyx2e" w:colFirst="0" w:colLast="0"/>
-    <w:bookmarkEnd w:id="10"/>
+    <w:bookmarkStart w:id="9" w:name="_98ru8atqyx2e" w:colFirst="0" w:colLast="0"/>
+    <w:bookmarkEnd w:id="9"/>
     <w:p>
       <w:pPr>
         <w:widowControl w:val="0"/>
@@ -1399,13 +1377,8 @@
         </w:rPr>
       </w:pPr>
       <w:r>
-        <w:rPr>
-          <w:noProof/>
-        </w:rPr>
-      </w:r>
-      <w:r>
-        <w:pict w14:anchorId="265761BB">
-          <v:rect id="Horizontal Line 4" o:spid="_x0000_s1028" style="width:539.45pt;height:.05pt;visibility:visible;mso-wrap-style:square;mso-left-percent:-10001;mso-top-percent:-10001;mso-position-horizontal:absolute;mso-position-horizontal-relative:char;mso-position-vertical:absolute;mso-position-vertical-relative:line;mso-left-percent:-10001;mso-top-percent:-10001;v-text-anchor:top" o:gfxdata="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" filled="f">
+        <w:pict w14:anchorId="1D4A0275">
+          <v:rect id="Horizontal Line 4" o:spid="_x0000_s1028" alt="" style="width:539.45pt;height:.05pt;visibility:visible;mso-wrap-style:square;mso-width-percent:0;mso-height-percent:0;mso-left-percent:-10001;mso-top-percent:-10001;mso-position-horizontal:absolute;mso-position-horizontal-relative:char;mso-position-vertical:absolute;mso-position-vertical-relative:line;mso-width-percent:0;mso-height-percent:0;mso-left-percent:-10001;mso-top-percent:-10001;v-text-anchor:top" filled="f">
             <o:lock v:ext="edit" rotation="t" aspectratio="t" verticies="t" text="t" shapetype="t"/>
             <w10:anchorlock/>
           </v:rect>
@@ -1552,13 +1525,8 @@
         </w:rPr>
       </w:pPr>
       <w:r>
-        <w:rPr>
-          <w:noProof/>
-        </w:rPr>
-      </w:r>
-      <w:r>
-        <w:pict w14:anchorId="19A0A214">
-          <v:rect id="Horizontal Line 5" o:spid="_x0000_s1027" style="width:539.85pt;height:.05pt;visibility:visible;mso-wrap-style:square;mso-left-percent:-10001;mso-top-percent:-10001;mso-position-horizontal:absolute;mso-position-horizontal-relative:char;mso-position-vertical:absolute;mso-position-vertical-relative:line;mso-left-percent:-10001;mso-top-percent:-10001;v-text-anchor:top" o:gfxdata="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" filled="f">
+        <w:pict w14:anchorId="3788B414">
+          <v:rect id="Horizontal Line 5" o:spid="_x0000_s1027" alt="" style="width:539.85pt;height:.05pt;visibility:visible;mso-wrap-style:square;mso-width-percent:0;mso-height-percent:0;mso-left-percent:-10001;mso-top-percent:-10001;mso-position-horizontal:absolute;mso-position-horizontal-relative:char;mso-position-vertical:absolute;mso-position-vertical-relative:line;mso-width-percent:0;mso-height-percent:0;mso-left-percent:-10001;mso-top-percent:-10001;v-text-anchor:top" filled="f">
             <o:lock v:ext="edit" rotation="t" aspectratio="t" verticies="t" text="t" shapetype="t"/>
             <w10:anchorlock/>
           </v:rect>
@@ -1725,13 +1693,8 @@
         </w:rPr>
       </w:pPr>
       <w:r>
-        <w:rPr>
-          <w:noProof/>
-        </w:rPr>
-      </w:r>
-      <w:r>
-        <w:pict w14:anchorId="61FA0D63">
-          <v:rect id="Horizontal Line 6" o:spid="_x0000_s1026" style="width:539.9pt;height:.05pt;visibility:visible;mso-wrap-style:square;mso-left-percent:-10001;mso-top-percent:-10001;mso-position-horizontal:absolute;mso-position-horizontal-relative:char;mso-position-vertical:absolute;mso-position-vertical-relative:line;mso-left-percent:-10001;mso-top-percent:-10001;v-text-anchor:top" o:gfxdata="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" filled="f">
+        <w:pict w14:anchorId="001FDD44">
+          <v:rect id="Horizontal Line 6" o:spid="_x0000_s1026" alt="" style="width:539.9pt;height:.05pt;visibility:visible;mso-wrap-style:square;mso-width-percent:0;mso-height-percent:0;mso-left-percent:-10001;mso-top-percent:-10001;mso-position-horizontal:absolute;mso-position-horizontal-relative:char;mso-position-vertical:absolute;mso-position-vertical-relative:line;mso-width-percent:0;mso-height-percent:0;mso-left-percent:-10001;mso-top-percent:-10001;v-text-anchor:top" filled="f">
             <o:lock v:ext="edit" rotation="t" aspectratio="t" verticies="t" text="t" shapetype="t"/>
             <w10:anchorlock/>
           </v:rect>
@@ -1757,7 +1720,7 @@
           <w:b/>
         </w:rPr>
       </w:pPr>
-      <w:bookmarkStart w:id="11" w:name="_Hlk233821999"/>
+      <w:bookmarkStart w:id="10" w:name="_Hlk233821999"/>
       <w:r>
         <w:rPr>
           <w:rFonts w:ascii="Times New Roman" w:eastAsia="Times New Roman" w:hAnsi="Times New Roman" w:cs="Times New Roman"/>
@@ -1851,7 +1814,7 @@
         </w:r>
       </w:hyperlink>
     </w:p>
-    <w:bookmarkEnd w:id="11"/>
+    <w:bookmarkEnd w:id="10"/>
     <w:p>
       <w:pPr>
         <w:widowControl w:val="0"/>

</xml_diff>